<commit_message>
Aclarar numero de WhatsApp en requisitos
</commit_message>
<xml_diff>
--- a/output/doc/ACTA_DE_REQUERIMIENTOS_MARKET_KM2.docx
+++ b/output/doc/ACTA_DE_REQUERIMIENTOS_MARKET_KM2.docx
@@ -42,11 +42,9 @@
         <w:rPr>
           <w:b/>
         </w:rPr>
-        <w:t>Version:</w:t>
+        <w:t>Version: 1.3</w:t>
       </w:r>
-      <w:r>
-        <w:t xml:space="preserve"> 1.2</w:t>
-      </w:r>
+      <w:r/>
     </w:p>
     <w:p>
       <w:r>
@@ -1097,7 +1095,7 @@
         <w:spacing w:after="20"/>
       </w:pPr>
       <w:r>
-        <w:t>Registro de cliente con nombre, correo, WhatsApp, direccion y contrasena.</w:t>
+        <w:t>Registro de cliente con nombre, correo, numero de WhatsApp, direccion y contrasena.</w:t>
       </w:r>
     </w:p>
     <w:p>
@@ -2260,14 +2258,15 @@
             <w:pPr>
               <w:spacing w:after="0" w:line="240" w:lineRule="auto"/>
             </w:pPr>
-            <w:r/>
+            <w:r>
+              <w:t>El sistema debe permitir registrar clientes con nombre, correo, numero de WhatsApp, direccion y contrasena.</w:t>
+            </w:r>
             <w:r>
               <w:rPr>
                 <w:rFonts w:ascii="Arial" w:hAnsi="Arial"/>
                 <w:b w:val="0"/>
                 <w:sz w:val="15"/>
               </w:rPr>
-              <w:t>El sistema debe permitir registrar clientes con nombre, correo, WhatsApp, direccion y contrasena.</w:t>
             </w:r>
           </w:p>
         </w:tc>
@@ -2444,14 +2443,15 @@
             <w:pPr>
               <w:spacing w:after="0" w:line="240" w:lineRule="auto"/>
             </w:pPr>
-            <w:r/>
+            <w:r>
+              <w:t>Nombre, numero de WhatsApp y direccion aparecen precargados cuando existen.</w:t>
+            </w:r>
             <w:r>
               <w:rPr>
                 <w:rFonts w:ascii="Arial" w:hAnsi="Arial"/>
                 <w:b w:val="0"/>
                 <w:sz w:val="15"/>
               </w:rPr>
-              <w:t>Nombre, WhatsApp y direccion aparecen precargados cuando existen.</w:t>
             </w:r>
           </w:p>
         </w:tc>
@@ -4819,6 +4819,30 @@
     <w:p>
       <w:pPr>
         <w:pStyle w:val="ListBullet"/>
+      </w:pPr>
+      <w:r>
+        <w:t>`clientes_web.celular`: numero de WhatsApp declarado por el cliente para contacto y precarga de checkout.</w:t>
+      </w:r>
+    </w:p>
+    <w:p>
+      <w:pPr>
+        <w:pStyle w:val="ListBullet"/>
+      </w:pPr>
+      <w:r>
+        <w:t>`pedidos_tienda.cliente_whatsapp`: numero de WhatsApp usado para contactar al cliente por el pedido.</w:t>
+      </w:r>
+    </w:p>
+    <w:p>
+      <w:pPr>
+        <w:pStyle w:val="ListBullet"/>
+      </w:pPr>
+      <w:r>
+        <w:t>`configuracion_tienda.whatsapp_number`: numero de WhatsApp de atencion del negocio usado para generar el enlace `wa.me`.</w:t>
+      </w:r>
+    </w:p>
+    <w:p>
+      <w:pPr>
+        <w:pStyle w:val="ListBullet"/>
         <w:spacing w:after="20"/>
       </w:pPr>
       <w:r>
@@ -4996,14 +5020,15 @@
             <w:pPr>
               <w:spacing w:after="0" w:line="240" w:lineRule="auto"/>
             </w:pPr>
-            <w:r/>
+            <w:r>
+              <w:t>El cliente puede registrarse con numero de WhatsApp, iniciar sesion y completar checkout.</w:t>
+            </w:r>
             <w:r>
               <w:rPr>
                 <w:rFonts w:ascii="Arial" w:hAnsi="Arial"/>
                 <w:b w:val="0"/>
                 <w:sz w:val="15"/>
               </w:rPr>
-              <w:t>El cliente puede registrarse, iniciar sesion y completar checkout.</w:t>
             </w:r>
           </w:p>
         </w:tc>
@@ -5122,14 +5147,15 @@
             <w:pPr>
               <w:spacing w:after="0" w:line="240" w:lineRule="auto"/>
             </w:pPr>
-            <w:r/>
+            <w:r>
+              <w:t>El pedido genera enlace de WhatsApp con resumen hacia el numero de atencion configurado.</w:t>
+            </w:r>
             <w:r>
               <w:rPr>
                 <w:rFonts w:ascii="Arial" w:hAnsi="Arial"/>
                 <w:b w:val="0"/>
                 <w:sz w:val="15"/>
               </w:rPr>
-              <w:t>El pedido genera enlace de WhatsApp con resumen.</w:t>
             </w:r>
           </w:p>
         </w:tc>

</xml_diff>